<commit_message>
update description for team section
</commit_message>
<xml_diff>
--- a/github-runbook.docx
+++ b/github-runbook.docx
@@ -74,6 +74,13 @@
           <w:rFonts w:ascii="Roboto" w:eastAsia="Roboto" w:hAnsi="Roboto" w:cs="Roboto"/>
         </w:rPr>
         <w:t>Teams in GitHub are a way to organize groups of users within an organization and manage their access to repositories.</w:t>
+      </w:r>
+      <w:r>
+        <w:rPr>
+          <w:rFonts w:ascii="Roboto" w:eastAsia="Roboto" w:hAnsi="Roboto" w:cs="Roboto"/>
+        </w:rPr>
+        <w:br/>
+        <w:t>This allows granular permission for teams with principles of least privilege</w:t>
       </w:r>
     </w:p>
     <w:p>
@@ -550,23 +557,7 @@
           <w:rFonts w:ascii="Roboto" w:eastAsia="Roboto" w:hAnsi="Roboto" w:cs="Roboto"/>
           <w:color w:val="188038"/>
         </w:rPr>
-        <w:t>backend-</w:t>
-      </w:r>
-      <w:proofErr w:type="spellStart"/>
-      <w:r>
-        <w:rPr>
-          <w:rFonts w:ascii="Roboto" w:eastAsia="Roboto" w:hAnsi="Roboto" w:cs="Roboto"/>
-          <w:color w:val="188038"/>
-        </w:rPr>
-        <w:t>api</w:t>
-      </w:r>
-      <w:proofErr w:type="spellEnd"/>
-      <w:r>
-        <w:rPr>
-          <w:rFonts w:ascii="Roboto" w:eastAsia="Roboto" w:hAnsi="Roboto" w:cs="Roboto"/>
-          <w:color w:val="188038"/>
-        </w:rPr>
-        <w:t>-team</w:t>
+        <w:t>backend-api-team</w:t>
       </w:r>
       <w:r>
         <w:rPr>
@@ -627,21 +618,7 @@
         <w:rPr>
           <w:rFonts w:ascii="Roboto" w:eastAsia="Roboto" w:hAnsi="Roboto" w:cs="Roboto"/>
         </w:rPr>
-        <w:t xml:space="preserve"> if you want to the new team to be a </w:t>
-      </w:r>
-      <w:proofErr w:type="spellStart"/>
-      <w:r>
-        <w:rPr>
-          <w:rFonts w:ascii="Roboto" w:eastAsia="Roboto" w:hAnsi="Roboto" w:cs="Roboto"/>
-        </w:rPr>
-        <w:t>subteam</w:t>
-      </w:r>
-      <w:proofErr w:type="spellEnd"/>
-      <w:r>
-        <w:rPr>
-          <w:rFonts w:ascii="Roboto" w:eastAsia="Roboto" w:hAnsi="Roboto" w:cs="Roboto"/>
-        </w:rPr>
-        <w:t xml:space="preserve"> of another team </w:t>
+        <w:t xml:space="preserve"> if you want to the new team to be a subteam of another team </w:t>
       </w:r>
     </w:p>
     <w:p>
@@ -836,21 +813,7 @@
         <w:rPr>
           <w:rFonts w:ascii="Roboto" w:eastAsia="Roboto" w:hAnsi="Roboto" w:cs="Roboto"/>
         </w:rPr>
-        <w:t xml:space="preserve"> (</w:t>
-      </w:r>
-      <w:proofErr w:type="spellStart"/>
-      <w:r>
-        <w:rPr>
-          <w:rFonts w:ascii="Roboto" w:eastAsia="Roboto" w:hAnsi="Roboto" w:cs="Roboto"/>
-        </w:rPr>
-        <w:t>e.g</w:t>
-      </w:r>
-      <w:proofErr w:type="spellEnd"/>
-      <w:r>
-        <w:rPr>
-          <w:rFonts w:ascii="Roboto" w:eastAsia="Roboto" w:hAnsi="Roboto" w:cs="Roboto"/>
-        </w:rPr>
-        <w:t xml:space="preserve"> </w:t>
+        <w:t xml:space="preserve"> (e.g </w:t>
       </w:r>
       <w:r>
         <w:rPr>
@@ -1337,21 +1300,7 @@
         <w:rPr>
           <w:rFonts w:ascii="Roboto" w:eastAsia="Roboto" w:hAnsi="Roboto" w:cs="Roboto"/>
         </w:rPr>
-        <w:t>Select the team you wish to add members to. (</w:t>
-      </w:r>
-      <w:proofErr w:type="spellStart"/>
-      <w:r>
-        <w:rPr>
-          <w:rFonts w:ascii="Roboto" w:eastAsia="Roboto" w:hAnsi="Roboto" w:cs="Roboto"/>
-        </w:rPr>
-        <w:t>e.g</w:t>
-      </w:r>
-      <w:proofErr w:type="spellEnd"/>
-      <w:r>
-        <w:rPr>
-          <w:rFonts w:ascii="Roboto" w:eastAsia="Roboto" w:hAnsi="Roboto" w:cs="Roboto"/>
-        </w:rPr>
-        <w:t xml:space="preserve"> </w:t>
+        <w:t xml:space="preserve">Select the team you wish to add members to. (e.g </w:t>
       </w:r>
       <w:r>
         <w:rPr>
@@ -5532,13 +5481,8 @@
         </w:rPr>
         <w:t xml:space="preserve">Do not allow bypassing the above settings: </w:t>
       </w:r>
-      <w:proofErr w:type="gramStart"/>
-      <w:r>
-        <w:t>This settings</w:t>
-      </w:r>
-      <w:proofErr w:type="gramEnd"/>
-      <w:r>
-        <w:t xml:space="preserve"> will apply to administrators and custom roles with the "bypass branch protections" permission. </w:t>
+      <w:r>
+        <w:t xml:space="preserve">This settings will apply to administrators and custom roles with the "bypass branch protections" permission. </w:t>
       </w:r>
     </w:p>
     <w:p>
@@ -5960,40 +5904,13 @@
         </w:rPr>
         <w:t xml:space="preserve"> </w:t>
       </w:r>
-      <w:proofErr w:type="spellStart"/>
       <w:r>
         <w:rPr>
           <w:rFonts w:ascii="Roboto" w:eastAsia="Roboto" w:hAnsi="Roboto" w:cs="Roboto"/>
           <w:color w:val="188038"/>
         </w:rPr>
-        <w:t>git@</w:t>
-      </w:r>
-      <w:proofErr w:type="gramStart"/>
-      <w:r>
-        <w:rPr>
-          <w:rFonts w:ascii="Roboto" w:eastAsia="Roboto" w:hAnsi="Roboto" w:cs="Roboto"/>
-          <w:color w:val="188038"/>
-        </w:rPr>
-        <w:t>URL:DEMO-SOA</w:t>
-      </w:r>
-      <w:proofErr w:type="spellEnd"/>
-      <w:r>
-        <w:rPr>
-          <w:rFonts w:ascii="Roboto" w:eastAsia="Roboto" w:hAnsi="Roboto" w:cs="Roboto"/>
-          <w:color w:val="188038"/>
-        </w:rPr>
-        <w:t>/repo-</w:t>
-      </w:r>
-      <w:proofErr w:type="spellStart"/>
-      <w:r>
-        <w:rPr>
-          <w:rFonts w:ascii="Roboto" w:eastAsia="Roboto" w:hAnsi="Roboto" w:cs="Roboto"/>
-          <w:color w:val="188038"/>
-        </w:rPr>
-        <w:t>name.git</w:t>
-      </w:r>
-      <w:proofErr w:type="spellEnd"/>
-      <w:proofErr w:type="gramEnd"/>
+        <w:t>git@URL:DEMO-SOA/repo-name.git</w:t>
+      </w:r>
       <w:r>
         <w:rPr>
           <w:rFonts w:ascii="Roboto" w:eastAsia="Roboto" w:hAnsi="Roboto" w:cs="Roboto"/>
@@ -6199,21 +6116,12 @@
         </w:rPr>
         <w:t xml:space="preserve"> </w:t>
       </w:r>
-      <w:proofErr w:type="spellStart"/>
       <w:r>
         <w:rPr>
           <w:rFonts w:ascii="Roboto" w:eastAsia="Roboto" w:hAnsi="Roboto" w:cs="Roboto"/>
           <w:color w:val="188038"/>
         </w:rPr>
-        <w:t>gh</w:t>
-      </w:r>
-      <w:proofErr w:type="spellEnd"/>
-      <w:r>
-        <w:rPr>
-          <w:rFonts w:ascii="Roboto" w:eastAsia="Roboto" w:hAnsi="Roboto" w:cs="Roboto"/>
-          <w:color w:val="188038"/>
-        </w:rPr>
-        <w:t xml:space="preserve"> repo clone username/repo-name</w:t>
+        <w:t>gh repo clone username/repo-name</w:t>
       </w:r>
       <w:r>
         <w:rPr>
@@ -6296,17 +6204,8 @@
           <w:rFonts w:ascii="Roboto Mono" w:eastAsia="Roboto Mono" w:hAnsi="Roboto Mono" w:cs="Roboto Mono"/>
           <w:color w:val="188038"/>
         </w:rPr>
-        <w:t xml:space="preserve">git clone </w:t>
-      </w:r>
-      <w:proofErr w:type="spellStart"/>
-      <w:r>
-        <w:rPr>
-          <w:rFonts w:ascii="Roboto Mono" w:eastAsia="Roboto Mono" w:hAnsi="Roboto Mono" w:cs="Roboto Mono"/>
-          <w:color w:val="188038"/>
-        </w:rPr>
-        <w:t>RepoURL</w:t>
-      </w:r>
-      <w:proofErr w:type="spellEnd"/>
+        <w:t>git clone RepoURL</w:t>
+      </w:r>
     </w:p>
     <w:p>
       <w:pPr>
@@ -6342,35 +6241,8 @@
           <w:rFonts w:ascii="Roboto Mono" w:eastAsia="Roboto Mono" w:hAnsi="Roboto Mono" w:cs="Roboto Mono"/>
           <w:color w:val="188038"/>
         </w:rPr>
-        <w:t xml:space="preserve">git clone </w:t>
-      </w:r>
-      <w:proofErr w:type="spellStart"/>
-      <w:proofErr w:type="gramStart"/>
-      <w:r>
-        <w:rPr>
-          <w:rFonts w:ascii="Roboto Mono" w:eastAsia="Roboto Mono" w:hAnsi="Roboto Mono" w:cs="Roboto Mono"/>
-          <w:color w:val="188038"/>
-        </w:rPr>
-        <w:t>git@github.com:my-org</w:t>
-      </w:r>
-      <w:proofErr w:type="spellEnd"/>
-      <w:r>
-        <w:rPr>
-          <w:rFonts w:ascii="Roboto Mono" w:eastAsia="Roboto Mono" w:hAnsi="Roboto Mono" w:cs="Roboto Mono"/>
-          <w:color w:val="188038"/>
-        </w:rPr>
-        <w:t>/my-</w:t>
-      </w:r>
-      <w:proofErr w:type="spellStart"/>
-      <w:r>
-        <w:rPr>
-          <w:rFonts w:ascii="Roboto Mono" w:eastAsia="Roboto Mono" w:hAnsi="Roboto Mono" w:cs="Roboto Mono"/>
-          <w:color w:val="188038"/>
-        </w:rPr>
-        <w:t>project.git</w:t>
-      </w:r>
-      <w:proofErr w:type="spellEnd"/>
-      <w:proofErr w:type="gramEnd"/>
+        <w:t>git clone git@github.com:my-org/my-project.git</w:t>
+      </w:r>
     </w:p>
     <w:p>
       <w:pPr>
@@ -6835,23 +6707,13 @@
         </w:rPr>
         <w:t xml:space="preserve">git status </w:t>
       </w:r>
-      <w:proofErr w:type="gramStart"/>
       <w:r>
         <w:rPr>
           <w:rFonts w:ascii="Roboto" w:eastAsia="Roboto" w:hAnsi="Roboto" w:cs="Roboto"/>
           <w:sz w:val="20"/>
           <w:szCs w:val="20"/>
         </w:rPr>
-        <w:t>To</w:t>
-      </w:r>
-      <w:proofErr w:type="gramEnd"/>
-      <w:r>
-        <w:rPr>
-          <w:rFonts w:ascii="Roboto" w:eastAsia="Roboto" w:hAnsi="Roboto" w:cs="Roboto"/>
-          <w:sz w:val="20"/>
-          <w:szCs w:val="20"/>
-        </w:rPr>
-        <w:t xml:space="preserve"> check the status of files and the current git area</w:t>
+        <w:t>To check the status of files and the current git area</w:t>
       </w:r>
     </w:p>
     <w:p>
@@ -6937,40 +6799,48 @@
           <w:sz w:val="20"/>
           <w:szCs w:val="20"/>
         </w:rPr>
-        <w:t xml:space="preserve">git </w:t>
-      </w:r>
-      <w:proofErr w:type="gramStart"/>
+        <w:t>git add .</w:t>
+      </w:r>
+      <w:r>
+        <w:rPr>
+          <w:sz w:val="20"/>
+          <w:szCs w:val="20"/>
+        </w:rPr>
+        <w:t xml:space="preserve">  (Adds every changes to the staging area and ready for commit) </w:t>
+      </w:r>
+    </w:p>
+    <w:p>
+      <w:pPr>
+        <w:shd w:val="clear" w:color="auto" w:fill="FFFFFF"/>
+        <w:ind w:left="3600" w:hanging="2160"/>
+        <w:rPr>
+          <w:b/>
+          <w:sz w:val="20"/>
+          <w:szCs w:val="20"/>
+        </w:rPr>
+      </w:pPr>
       <w:r>
         <w:rPr>
           <w:rFonts w:ascii="Courier New" w:eastAsia="Courier New" w:hAnsi="Courier New" w:cs="Courier New"/>
           <w:sz w:val="20"/>
           <w:szCs w:val="20"/>
         </w:rPr>
-        <w:t>add .</w:t>
-      </w:r>
-      <w:proofErr w:type="gramEnd"/>
-      <w:r>
-        <w:rPr>
+        <w:t>git add filename</w:t>
+      </w:r>
+      <w:r>
+        <w:rPr>
+          <w:b/>
           <w:sz w:val="20"/>
           <w:szCs w:val="20"/>
         </w:rPr>
-        <w:t xml:space="preserve">  (Adds every </w:t>
-      </w:r>
-      <w:proofErr w:type="gramStart"/>
+        <w:t xml:space="preserve"> (</w:t>
+      </w:r>
       <w:r>
         <w:rPr>
           <w:sz w:val="20"/>
           <w:szCs w:val="20"/>
         </w:rPr>
-        <w:t>changes</w:t>
-      </w:r>
-      <w:proofErr w:type="gramEnd"/>
-      <w:r>
-        <w:rPr>
-          <w:sz w:val="20"/>
-          <w:szCs w:val="20"/>
-        </w:rPr>
-        <w:t xml:space="preserve"> to the staging area and ready for commit) </w:t>
+        <w:t>Adds file to the staging area and ready for commit)</w:t>
       </w:r>
     </w:p>
     <w:p>
@@ -6978,7 +6848,6 @@
         <w:shd w:val="clear" w:color="auto" w:fill="FFFFFF"/>
         <w:ind w:left="3600" w:hanging="2160"/>
         <w:rPr>
-          <w:b/>
           <w:sz w:val="20"/>
           <w:szCs w:val="20"/>
         </w:rPr>
@@ -6989,58 +6858,7 @@
           <w:sz w:val="20"/>
           <w:szCs w:val="20"/>
         </w:rPr>
-        <w:t>git add filename</w:t>
-      </w:r>
-      <w:r>
-        <w:rPr>
-          <w:b/>
-          <w:sz w:val="20"/>
-          <w:szCs w:val="20"/>
-        </w:rPr>
-        <w:t xml:space="preserve"> (</w:t>
-      </w:r>
-      <w:r>
-        <w:rPr>
-          <w:sz w:val="20"/>
-          <w:szCs w:val="20"/>
-        </w:rPr>
-        <w:t>Adds file to the staging area and ready for commit)</w:t>
-      </w:r>
-    </w:p>
-    <w:p>
-      <w:pPr>
-        <w:shd w:val="clear" w:color="auto" w:fill="FFFFFF"/>
-        <w:ind w:left="3600" w:hanging="2160"/>
-        <w:rPr>
-          <w:sz w:val="20"/>
-          <w:szCs w:val="20"/>
-        </w:rPr>
-      </w:pPr>
-      <w:r>
-        <w:rPr>
-          <w:rFonts w:ascii="Courier New" w:eastAsia="Courier New" w:hAnsi="Courier New" w:cs="Courier New"/>
-          <w:sz w:val="20"/>
-          <w:szCs w:val="20"/>
-        </w:rPr>
-        <w:t xml:space="preserve">git add </w:t>
-      </w:r>
-      <w:proofErr w:type="spellStart"/>
-      <w:r>
-        <w:rPr>
-          <w:rFonts w:ascii="Courier New" w:eastAsia="Courier New" w:hAnsi="Courier New" w:cs="Courier New"/>
-          <w:sz w:val="20"/>
-          <w:szCs w:val="20"/>
-        </w:rPr>
-        <w:t>foldername</w:t>
-      </w:r>
-      <w:proofErr w:type="spellEnd"/>
-      <w:r>
-        <w:rPr>
-          <w:rFonts w:ascii="Courier New" w:eastAsia="Courier New" w:hAnsi="Courier New" w:cs="Courier New"/>
-          <w:sz w:val="20"/>
-          <w:szCs w:val="20"/>
-        </w:rPr>
-        <w:t xml:space="preserve"> </w:t>
+        <w:t xml:space="preserve">git add foldername </w:t>
       </w:r>
       <w:r>
         <w:rPr>
@@ -7437,32 +7255,31 @@
           <w:sz w:val="20"/>
           <w:szCs w:val="20"/>
         </w:rPr>
-        <w:t xml:space="preserve">Remote </w:t>
-      </w:r>
-      <w:proofErr w:type="spellStart"/>
-      <w:r>
-        <w:rPr>
-          <w:b/>
+        <w:t>Remote RepositoryThe shared repo</w:t>
+      </w:r>
+      <w:r>
+        <w:rPr>
           <w:sz w:val="20"/>
           <w:szCs w:val="20"/>
         </w:rPr>
-        <w:t>RepositoryThe</w:t>
-      </w:r>
-      <w:proofErr w:type="spellEnd"/>
-      <w:r>
-        <w:rPr>
-          <w:b/>
+        <w:t xml:space="preserve"> hosted on GitHub</w:t>
+      </w:r>
+    </w:p>
+    <w:p>
+      <w:pPr>
+        <w:shd w:val="clear" w:color="auto" w:fill="FFFFFF"/>
+        <w:ind w:left="2160" w:hanging="720"/>
+        <w:rPr>
           <w:sz w:val="20"/>
           <w:szCs w:val="20"/>
         </w:rPr>
-        <w:t xml:space="preserve"> shared repo</w:t>
-      </w:r>
+      </w:pPr>
       <w:r>
         <w:rPr>
           <w:sz w:val="20"/>
           <w:szCs w:val="20"/>
         </w:rPr>
-        <w:t xml:space="preserve"> hosted on GitHub</w:t>
+        <w:t>Collaborators push to and pull from this repo. Sync changes using:</w:t>
       </w:r>
     </w:p>
     <w:p>
@@ -7470,6 +7287,7 @@
         <w:shd w:val="clear" w:color="auto" w:fill="FFFFFF"/>
         <w:ind w:left="2160" w:hanging="720"/>
         <w:rPr>
+          <w:b/>
           <w:sz w:val="20"/>
           <w:szCs w:val="20"/>
         </w:rPr>
@@ -7479,7 +7297,15 @@
           <w:sz w:val="20"/>
           <w:szCs w:val="20"/>
         </w:rPr>
-        <w:t>Collaborators push to and pull from this repo. Sync changes using:</w:t>
+        <w:t xml:space="preserve">git branch (To check the branches and the active branch, (e.g </w:t>
+      </w:r>
+      <w:r>
+        <w:rPr>
+          <w:b/>
+          <w:sz w:val="20"/>
+          <w:szCs w:val="20"/>
+        </w:rPr>
+        <w:t>*Active-Branch-Name)</w:t>
       </w:r>
     </w:p>
     <w:p>
@@ -7487,79 +7313,30 @@
         <w:shd w:val="clear" w:color="auto" w:fill="FFFFFF"/>
         <w:ind w:left="2160" w:hanging="720"/>
         <w:rPr>
-          <w:b/>
           <w:sz w:val="20"/>
           <w:szCs w:val="20"/>
         </w:rPr>
       </w:pPr>
       <w:r>
         <w:rPr>
+          <w:b/>
           <w:sz w:val="20"/>
           <w:szCs w:val="20"/>
         </w:rPr>
-        <w:t>git branch (To check the branches and the active branch, (</w:t>
-      </w:r>
-      <w:proofErr w:type="spellStart"/>
+        <w:t>git push</w:t>
+      </w:r>
       <w:r>
         <w:rPr>
           <w:sz w:val="20"/>
           <w:szCs w:val="20"/>
         </w:rPr>
-        <w:t>e.g</w:t>
-      </w:r>
-      <w:proofErr w:type="spellEnd"/>
-      <w:r>
-        <w:rPr>
-          <w:sz w:val="20"/>
-          <w:szCs w:val="20"/>
-        </w:rPr>
-        <w:t xml:space="preserve"> </w:t>
-      </w:r>
-      <w:r>
-        <w:rPr>
-          <w:b/>
-          <w:sz w:val="20"/>
-          <w:szCs w:val="20"/>
-        </w:rPr>
-        <w:t>*Active-Branch-Name)</w:t>
-      </w:r>
-    </w:p>
-    <w:p>
-      <w:pPr>
-        <w:shd w:val="clear" w:color="auto" w:fill="FFFFFF"/>
-        <w:ind w:left="2160" w:hanging="720"/>
-        <w:rPr>
-          <w:sz w:val="20"/>
-          <w:szCs w:val="20"/>
-        </w:rPr>
-      </w:pPr>
-      <w:r>
-        <w:rPr>
-          <w:b/>
-          <w:sz w:val="20"/>
-          <w:szCs w:val="20"/>
-        </w:rPr>
-        <w:t>git push</w:t>
-      </w:r>
-      <w:r>
-        <w:rPr>
-          <w:sz w:val="20"/>
-          <w:szCs w:val="20"/>
-        </w:rPr>
         <w:t xml:space="preserve"> -u origin active-</w:t>
       </w:r>
       <w:r>
         <w:rPr>
           <w:rFonts w:ascii="Roboto" w:eastAsia="Roboto" w:hAnsi="Roboto" w:cs="Roboto"/>
         </w:rPr>
-        <w:t>branch-</w:t>
-      </w:r>
-      <w:proofErr w:type="gramStart"/>
-      <w:r>
-        <w:rPr>
-          <w:rFonts w:ascii="Roboto" w:eastAsia="Roboto" w:hAnsi="Roboto" w:cs="Roboto"/>
-        </w:rPr>
-        <w:t xml:space="preserve">name  </w:t>
+        <w:t xml:space="preserve">branch-name  </w:t>
       </w:r>
       <w:r>
         <w:rPr>
@@ -7567,34 +7344,7 @@
           <w:sz w:val="20"/>
           <w:szCs w:val="20"/>
         </w:rPr>
-        <w:t>(</w:t>
-      </w:r>
-      <w:proofErr w:type="gramEnd"/>
-      <w:r>
-        <w:rPr>
-          <w:rFonts w:ascii="Arial Unicode MS" w:eastAsia="Arial Unicode MS" w:hAnsi="Arial Unicode MS" w:cs="Arial Unicode MS"/>
-          <w:sz w:val="20"/>
-          <w:szCs w:val="20"/>
-        </w:rPr>
-        <w:t xml:space="preserve">Pushing your changes from </w:t>
-      </w:r>
-      <w:proofErr w:type="gramStart"/>
-      <w:r>
-        <w:rPr>
-          <w:rFonts w:ascii="Arial Unicode MS" w:eastAsia="Arial Unicode MS" w:hAnsi="Arial Unicode MS" w:cs="Arial Unicode MS"/>
-          <w:sz w:val="20"/>
-          <w:szCs w:val="20"/>
-        </w:rPr>
-        <w:t>local  →</w:t>
-      </w:r>
-      <w:proofErr w:type="gramEnd"/>
-      <w:r>
-        <w:rPr>
-          <w:rFonts w:ascii="Arial Unicode MS" w:eastAsia="Arial Unicode MS" w:hAnsi="Arial Unicode MS" w:cs="Arial Unicode MS"/>
-          <w:sz w:val="20"/>
-          <w:szCs w:val="20"/>
-        </w:rPr>
-        <w:t xml:space="preserve"> remote)</w:t>
+        <w:t>(Pushing your changes from local  → remote)</w:t>
       </w:r>
     </w:p>
     <w:p>
@@ -8228,23 +7978,7 @@
     </w:p>
     <w:p>
       <w:r>
-        <w:t>* [</w:t>
-      </w:r>
-      <w:proofErr w:type="spellStart"/>
-      <w:r>
-        <w:t>TicketNo</w:t>
-      </w:r>
-      <w:proofErr w:type="spellEnd"/>
-      <w:r>
-        <w:t>](</w:t>
-      </w:r>
-      <w:proofErr w:type="spellStart"/>
-      <w:r>
-        <w:t>url</w:t>
-      </w:r>
-      <w:proofErr w:type="spellEnd"/>
-      <w:r>
-        <w:t>)</w:t>
+        <w:t>* [TicketNo](url)</w:t>
       </w:r>
     </w:p>
     <w:p/>

</xml_diff>